<commit_message>
Reformat Part 1 Episode 1 to match the 9부2화 reference layout
Rebuilt the docx to mirror the attached 9부2화_El_primer_Pleno.docx
exactly: page header/footer (running title + page number field),
identical title-block spacing and font sizes (ROMA 30pt, subtitle
26pt, part/episode 24pt, title 40pt, meta lines 18pt, cast 20/18pt),
left-aligned 16pt italic synopsis, and a 22pt "다음 화 예고" heading.
Dialogue turn styling (20pt speaker / 22pt Italian / 18pt Korean)
is unchanged.

Co-Authored-By: Claude Sonnet 5 <noreply@anthropic.com>
Claude-Session: https://claude.ai/code/session_01F4RAWDNSfRbtuchEfG1S4a
</commit_message>
<xml_diff>
--- a/1부1화_Un_altra_lettera.docx
+++ b/1부1화_Un_altra_lettera.docx
@@ -4,6 +4,7 @@
   <w:body>
     <w:p>
       <w:pPr>
+        <w:spacing w:before="2400" w:after="200"/>
         <w:jc w:val="center"/>
       </w:pPr>
       <w:r>
@@ -18,6 +19,7 @@
     </w:p>
     <w:p>
       <w:pPr>
+        <w:spacing w:after="100"/>
         <w:jc w:val="center"/>
       </w:pPr>
       <w:r>
@@ -32,6 +34,7 @@
     </w:p>
     <w:p>
       <w:pPr>
+        <w:spacing w:before="600" w:after="100"/>
         <w:jc w:val="center"/>
       </w:pPr>
       <w:r>
@@ -46,6 +49,7 @@
     </w:p>
     <w:p>
       <w:pPr>
+        <w:spacing w:after="40"/>
         <w:jc w:val="center"/>
       </w:pPr>
       <w:r>
@@ -60,6 +64,7 @@
     </w:p>
     <w:p>
       <w:pPr>
+        <w:spacing w:after="600"/>
         <w:jc w:val="center"/>
       </w:pPr>
       <w:r>
@@ -74,6 +79,7 @@
     </w:p>
     <w:p>
       <w:pPr>
+        <w:spacing w:after="40"/>
         <w:jc w:val="center"/>
       </w:pPr>
       <w:r>
@@ -83,11 +89,12 @@
           <w:color w:val="595959"/>
           <w:sz w:val="36"/>
         </w:rPr>
-        <w:t>대사 120턴 · 난이도 B1 · 배경: 저녁 다섯 시부터 밤까지, Testaccio 사무소 · Trattoria da Rosa</w:t>
+        <w:t>대사 119턴 · 난이도 B1 · 배경: 저녁 다섯 시부터 밤까지, Testaccio 사무소 · Trattoria da Rosa</w:t>
       </w:r>
     </w:p>
     <w:p>
       <w:pPr>
+        <w:spacing w:after="40"/>
         <w:jc w:val="center"/>
       </w:pPr>
       <w:r>
@@ -102,6 +109,7 @@
     </w:p>
     <w:p>
       <w:pPr>
+        <w:spacing w:before="500" w:after="150"/>
         <w:jc w:val="center"/>
       </w:pPr>
       <w:r>
@@ -116,6 +124,7 @@
     </w:p>
     <w:p>
       <w:pPr>
+        <w:spacing w:after="40"/>
         <w:jc w:val="center"/>
       </w:pPr>
       <w:r>
@@ -135,6 +144,7 @@
     </w:p>
     <w:p>
       <w:pPr>
+        <w:spacing w:after="40"/>
         <w:jc w:val="center"/>
       </w:pPr>
       <w:r>
@@ -154,6 +164,7 @@
     </w:p>
     <w:p>
       <w:pPr>
+        <w:spacing w:after="40"/>
         <w:jc w:val="center"/>
       </w:pPr>
       <w:r>
@@ -173,6 +184,7 @@
     </w:p>
     <w:p>
       <w:pPr>
+        <w:spacing w:after="40"/>
         <w:jc w:val="center"/>
       </w:pPr>
       <w:r>
@@ -192,6 +204,7 @@
     </w:p>
     <w:p>
       <w:pPr>
+        <w:spacing w:after="40"/>
         <w:jc w:val="center"/>
       </w:pPr>
       <w:r>
@@ -211,6 +224,7 @@
     </w:p>
     <w:p>
       <w:pPr>
+        <w:spacing w:after="40"/>
         <w:jc w:val="center"/>
       </w:pPr>
       <w:r>
@@ -230,6 +244,7 @@
     </w:p>
     <w:p>
       <w:pPr>
+        <w:spacing w:after="40"/>
         <w:jc w:val="center"/>
       </w:pPr>
       <w:r>
@@ -249,6 +264,7 @@
     </w:p>
     <w:p>
       <w:pPr>
+        <w:spacing w:after="40"/>
         <w:jc w:val="center"/>
       </w:pPr>
       <w:r>
@@ -268,6 +284,7 @@
     </w:p>
     <w:p>
       <w:pPr>
+        <w:spacing w:after="40"/>
         <w:jc w:val="center"/>
       </w:pPr>
       <w:r>
@@ -287,6 +304,7 @@
     </w:p>
     <w:p>
       <w:pPr>
+        <w:spacing w:after="40"/>
         <w:jc w:val="center"/>
       </w:pPr>
       <w:r>
@@ -306,18 +324,19 @@
     </w:p>
     <w:p>
       <w:pPr>
-        <w:jc w:val="center"/>
+        <w:spacing w:before="400"/>
       </w:pPr>
       <w:r>
         <w:rPr>
           <w:b w:val="0"/>
-          <w:i w:val="0"/>
-          <w:color w:val="404040"/>
-          <w:sz w:val="36"/>
+          <w:i/>
+          <w:color w:val="808080"/>
+          <w:sz w:val="32"/>
         </w:rPr>
         <w:t>※ 사무소가 문을 연 지 한 달, 오늘도 다섯 시 회의는 방법을 두고 다툽니다. 파티마가 두 번째로 찾아와 새 임대료 인상 통지서와 퇴거 경고장을 내밉니다. Gramsci는 «날짜를 세어 보라»는 힌트만 던지고, Machiavelli는 «이 집의 진짜 주인이 누구인가»만 묻습니다. 계약서를 찾지 못해 결정은 내일로 미뤄집니다. 표현 초점: 현재형과 근접 미래 — comincia, decidiamo, devo leggere, domani deciderà.</w:t>
       </w:r>
     </w:p>
+    <w:p/>
     <w:p>
       <w:pPr>
         <w:spacing w:before="400" w:after="240"/>
@@ -352,9 +371,6 @@
       </w:r>
     </w:p>
     <w:p>
-      <w:pPr>
-        <w:spacing w:before="0" w:after="240"/>
-      </w:pPr>
       <w:r>
         <w:rPr>
           <w:i/>
@@ -371,7 +387,7 @@
       <w:r>
         <w:rPr>
           <w:b/>
-          <w:color w:val="1F3864"/>
+          <w:color w:val="7F6000"/>
           <w:sz w:val="40"/>
         </w:rPr>
         <w:t>MARCO</w:t>
@@ -385,9 +401,6 @@
       </w:r>
     </w:p>
     <w:p>
-      <w:pPr>
-        <w:spacing w:before="0" w:after="240"/>
-      </w:pPr>
       <w:r>
         <w:rPr>
           <w:i/>
@@ -418,9 +431,6 @@
       </w:r>
     </w:p>
     <w:p>
-      <w:pPr>
-        <w:spacing w:before="0" w:after="240"/>
-      </w:pPr>
       <w:r>
         <w:rPr>
           <w:i/>
@@ -437,7 +447,7 @@
       <w:r>
         <w:rPr>
           <w:b/>
-          <w:color w:val="7F6000"/>
+          <w:color w:val="0E7C86"/>
           <w:sz w:val="40"/>
         </w:rPr>
         <w:t>ALESSANDRO</w:t>
@@ -451,9 +461,6 @@
       </w:r>
     </w:p>
     <w:p>
-      <w:pPr>
-        <w:spacing w:before="0" w:after="240"/>
-      </w:pPr>
       <w:r>
         <w:rPr>
           <w:i/>
@@ -484,9 +491,6 @@
       </w:r>
     </w:p>
     <w:p>
-      <w:pPr>
-        <w:spacing w:before="0" w:after="240"/>
-      </w:pPr>
       <w:r>
         <w:rPr>
           <w:i/>
@@ -517,9 +521,6 @@
       </w:r>
     </w:p>
     <w:p>
-      <w:pPr>
-        <w:spacing w:before="0" w:after="240"/>
-      </w:pPr>
       <w:r>
         <w:rPr>
           <w:i/>
@@ -536,7 +537,7 @@
       <w:r>
         <w:rPr>
           <w:b/>
-          <w:color w:val="7F6000"/>
+          <w:color w:val="0E7C86"/>
           <w:sz w:val="40"/>
         </w:rPr>
         <w:t>ALESSANDRO</w:t>
@@ -550,9 +551,6 @@
       </w:r>
     </w:p>
     <w:p>
-      <w:pPr>
-        <w:spacing w:before="0" w:after="240"/>
-      </w:pPr>
       <w:r>
         <w:rPr>
           <w:i/>
@@ -583,9 +581,6 @@
       </w:r>
     </w:p>
     <w:p>
-      <w:pPr>
-        <w:spacing w:before="0" w:after="240"/>
-      </w:pPr>
       <w:r>
         <w:rPr>
           <w:i/>
@@ -602,7 +597,7 @@
       <w:r>
         <w:rPr>
           <w:b/>
-          <w:color w:val="1F3864"/>
+          <w:color w:val="7F6000"/>
           <w:sz w:val="40"/>
         </w:rPr>
         <w:t>MARCO</w:t>
@@ -616,9 +611,6 @@
       </w:r>
     </w:p>
     <w:p>
-      <w:pPr>
-        <w:spacing w:before="0" w:after="240"/>
-      </w:pPr>
       <w:r>
         <w:rPr>
           <w:i/>
@@ -649,9 +641,6 @@
       </w:r>
     </w:p>
     <w:p>
-      <w:pPr>
-        <w:spacing w:before="0" w:after="240"/>
-      </w:pPr>
       <w:r>
         <w:rPr>
           <w:i/>
@@ -668,7 +657,7 @@
       <w:r>
         <w:rPr>
           <w:b/>
-          <w:color w:val="4E342E"/>
+          <w:color w:val="6D4C41"/>
           <w:sz w:val="40"/>
         </w:rPr>
         <w:t>GRAMSCI</w:t>
@@ -682,9 +671,6 @@
       </w:r>
     </w:p>
     <w:p>
-      <w:pPr>
-        <w:spacing w:before="0" w:after="240"/>
-      </w:pPr>
       <w:r>
         <w:rPr>
           <w:i/>
@@ -715,9 +701,6 @@
       </w:r>
     </w:p>
     <w:p>
-      <w:pPr>
-        <w:spacing w:before="0" w:after="240"/>
-      </w:pPr>
       <w:r>
         <w:rPr>
           <w:i/>
@@ -734,7 +717,7 @@
       <w:r>
         <w:rPr>
           <w:b/>
-          <w:color w:val="4E342E"/>
+          <w:color w:val="6D4C41"/>
           <w:sz w:val="40"/>
         </w:rPr>
         <w:t>GRAMSCI</w:t>
@@ -748,9 +731,6 @@
       </w:r>
     </w:p>
     <w:p>
-      <w:pPr>
-        <w:spacing w:before="0" w:after="240"/>
-      </w:pPr>
       <w:r>
         <w:rPr>
           <w:i/>
@@ -767,7 +747,7 @@
       <w:r>
         <w:rPr>
           <w:b/>
-          <w:color w:val="1F3864"/>
+          <w:color w:val="7F6000"/>
           <w:sz w:val="40"/>
         </w:rPr>
         <w:t>MARCO</w:t>
@@ -781,9 +761,6 @@
       </w:r>
     </w:p>
     <w:p>
-      <w:pPr>
-        <w:spacing w:before="0" w:after="240"/>
-      </w:pPr>
       <w:r>
         <w:rPr>
           <w:i/>
@@ -814,9 +791,6 @@
       </w:r>
     </w:p>
     <w:p>
-      <w:pPr>
-        <w:spacing w:before="0" w:after="240"/>
-      </w:pPr>
       <w:r>
         <w:rPr>
           <w:i/>
@@ -847,9 +821,6 @@
       </w:r>
     </w:p>
     <w:p>
-      <w:pPr>
-        <w:spacing w:before="0" w:after="240"/>
-      </w:pPr>
       <w:r>
         <w:rPr>
           <w:i/>
@@ -880,9 +851,6 @@
       </w:r>
     </w:p>
     <w:p>
-      <w:pPr>
-        <w:spacing w:before="0" w:after="240"/>
-      </w:pPr>
       <w:r>
         <w:rPr>
           <w:i/>
@@ -912,7 +880,7 @@
       <w:r>
         <w:rPr>
           <w:b/>
-          <w:color w:val="0E7C86"/>
+          <w:color w:val="A64D79"/>
           <w:sz w:val="40"/>
         </w:rPr>
         <w:t>FATIMA</w:t>
@@ -926,9 +894,6 @@
       </w:r>
     </w:p>
     <w:p>
-      <w:pPr>
-        <w:spacing w:before="0" w:after="240"/>
-      </w:pPr>
       <w:r>
         <w:rPr>
           <w:i/>
@@ -959,9 +924,6 @@
       </w:r>
     </w:p>
     <w:p>
-      <w:pPr>
-        <w:spacing w:before="0" w:after="240"/>
-      </w:pPr>
       <w:r>
         <w:rPr>
           <w:i/>
@@ -978,7 +940,7 @@
       <w:r>
         <w:rPr>
           <w:b/>
-          <w:color w:val="0E7C86"/>
+          <w:color w:val="A64D79"/>
           <w:sz w:val="40"/>
         </w:rPr>
         <w:t>FATIMA</w:t>
@@ -992,9 +954,6 @@
       </w:r>
     </w:p>
     <w:p>
-      <w:pPr>
-        <w:spacing w:before="0" w:after="240"/>
-      </w:pPr>
       <w:r>
         <w:rPr>
           <w:i/>
@@ -1011,7 +970,7 @@
       <w:r>
         <w:rPr>
           <w:b/>
-          <w:color w:val="1F3864"/>
+          <w:color w:val="7F6000"/>
           <w:sz w:val="40"/>
         </w:rPr>
         <w:t>MARCO</w:t>
@@ -1025,9 +984,6 @@
       </w:r>
     </w:p>
     <w:p>
-      <w:pPr>
-        <w:spacing w:before="0" w:after="240"/>
-      </w:pPr>
       <w:r>
         <w:rPr>
           <w:i/>
@@ -1044,7 +1000,7 @@
       <w:r>
         <w:rPr>
           <w:b/>
-          <w:color w:val="0E7C86"/>
+          <w:color w:val="A64D79"/>
           <w:sz w:val="40"/>
         </w:rPr>
         <w:t>FATIMA</w:t>
@@ -1058,9 +1014,6 @@
       </w:r>
     </w:p>
     <w:p>
-      <w:pPr>
-        <w:spacing w:before="0" w:after="240"/>
-      </w:pPr>
       <w:r>
         <w:rPr>
           <w:i/>
@@ -1091,9 +1044,6 @@
       </w:r>
     </w:p>
     <w:p>
-      <w:pPr>
-        <w:spacing w:before="0" w:after="240"/>
-      </w:pPr>
       <w:r>
         <w:rPr>
           <w:i/>
@@ -1110,7 +1060,7 @@
       <w:r>
         <w:rPr>
           <w:b/>
-          <w:color w:val="0E7C86"/>
+          <w:color w:val="A64D79"/>
           <w:sz w:val="40"/>
         </w:rPr>
         <w:t>FATIMA</w:t>
@@ -1124,9 +1074,6 @@
       </w:r>
     </w:p>
     <w:p>
-      <w:pPr>
-        <w:spacing w:before="0" w:after="240"/>
-      </w:pPr>
       <w:r>
         <w:rPr>
           <w:i/>
@@ -1143,7 +1090,7 @@
       <w:r>
         <w:rPr>
           <w:b/>
-          <w:color w:val="7F6000"/>
+          <w:color w:val="0E7C86"/>
           <w:sz w:val="40"/>
         </w:rPr>
         <w:t>ALESSANDRO</w:t>
@@ -1157,9 +1104,6 @@
       </w:r>
     </w:p>
     <w:p>
-      <w:pPr>
-        <w:spacing w:before="0" w:after="240"/>
-      </w:pPr>
       <w:r>
         <w:rPr>
           <w:i/>
@@ -1176,7 +1120,7 @@
       <w:r>
         <w:rPr>
           <w:b/>
-          <w:color w:val="0E7C86"/>
+          <w:color w:val="A64D79"/>
           <w:sz w:val="40"/>
         </w:rPr>
         <w:t>FATIMA</w:t>
@@ -1190,9 +1134,6 @@
       </w:r>
     </w:p>
     <w:p>
-      <w:pPr>
-        <w:spacing w:before="0" w:after="240"/>
-      </w:pPr>
       <w:r>
         <w:rPr>
           <w:i/>
@@ -1223,9 +1164,6 @@
       </w:r>
     </w:p>
     <w:p>
-      <w:pPr>
-        <w:spacing w:before="0" w:after="240"/>
-      </w:pPr>
       <w:r>
         <w:rPr>
           <w:i/>
@@ -1242,7 +1180,7 @@
       <w:r>
         <w:rPr>
           <w:b/>
-          <w:color w:val="7F6000"/>
+          <w:color w:val="0E7C86"/>
           <w:sz w:val="40"/>
         </w:rPr>
         <w:t>ALESSANDRO</w:t>
@@ -1256,9 +1194,6 @@
       </w:r>
     </w:p>
     <w:p>
-      <w:pPr>
-        <w:spacing w:before="0" w:after="240"/>
-      </w:pPr>
       <w:r>
         <w:rPr>
           <w:i/>
@@ -1289,9 +1224,6 @@
       </w:r>
     </w:p>
     <w:p>
-      <w:pPr>
-        <w:spacing w:before="0" w:after="240"/>
-      </w:pPr>
       <w:r>
         <w:rPr>
           <w:i/>
@@ -1308,7 +1240,7 @@
       <w:r>
         <w:rPr>
           <w:b/>
-          <w:color w:val="1F3864"/>
+          <w:color w:val="7F6000"/>
           <w:sz w:val="40"/>
         </w:rPr>
         <w:t>MARCO</w:t>
@@ -1322,9 +1254,6 @@
       </w:r>
     </w:p>
     <w:p>
-      <w:pPr>
-        <w:spacing w:before="0" w:after="240"/>
-      </w:pPr>
       <w:r>
         <w:rPr>
           <w:i/>
@@ -1355,9 +1284,6 @@
       </w:r>
     </w:p>
     <w:p>
-      <w:pPr>
-        <w:spacing w:before="0" w:after="240"/>
-      </w:pPr>
       <w:r>
         <w:rPr>
           <w:i/>
@@ -1374,7 +1300,7 @@
       <w:r>
         <w:rPr>
           <w:b/>
-          <w:color w:val="1F3864"/>
+          <w:color w:val="7F6000"/>
           <w:sz w:val="40"/>
         </w:rPr>
         <w:t>MARCO</w:t>
@@ -1388,9 +1314,6 @@
       </w:r>
     </w:p>
     <w:p>
-      <w:pPr>
-        <w:spacing w:before="0" w:after="240"/>
-      </w:pPr>
       <w:r>
         <w:rPr>
           <w:i/>
@@ -1407,7 +1330,7 @@
       <w:r>
         <w:rPr>
           <w:b/>
-          <w:color w:val="0E7C86"/>
+          <w:color w:val="A64D79"/>
           <w:sz w:val="40"/>
         </w:rPr>
         <w:t>FATIMA</w:t>
@@ -1421,9 +1344,6 @@
       </w:r>
     </w:p>
     <w:p>
-      <w:pPr>
-        <w:spacing w:before="0" w:after="240"/>
-      </w:pPr>
       <w:r>
         <w:rPr>
           <w:i/>
@@ -1454,9 +1374,6 @@
       </w:r>
     </w:p>
     <w:p>
-      <w:pPr>
-        <w:spacing w:before="0" w:after="240"/>
-      </w:pPr>
       <w:r>
         <w:rPr>
           <w:i/>
@@ -1473,7 +1390,7 @@
       <w:r>
         <w:rPr>
           <w:b/>
-          <w:color w:val="0E7C86"/>
+          <w:color w:val="A64D79"/>
           <w:sz w:val="40"/>
         </w:rPr>
         <w:t>FATIMA</w:t>
@@ -1487,9 +1404,6 @@
       </w:r>
     </w:p>
     <w:p>
-      <w:pPr>
-        <w:spacing w:before="0" w:after="240"/>
-      </w:pPr>
       <w:r>
         <w:rPr>
           <w:i/>
@@ -1520,9 +1434,6 @@
       </w:r>
     </w:p>
     <w:p>
-      <w:pPr>
-        <w:spacing w:before="0" w:after="240"/>
-      </w:pPr>
       <w:r>
         <w:rPr>
           <w:i/>
@@ -1553,9 +1464,6 @@
       </w:r>
     </w:p>
     <w:p>
-      <w:pPr>
-        <w:spacing w:before="0" w:after="240"/>
-      </w:pPr>
       <w:r>
         <w:rPr>
           <w:i/>
@@ -1572,7 +1480,7 @@
       <w:r>
         <w:rPr>
           <w:b/>
-          <w:color w:val="0E7C86"/>
+          <w:color w:val="A64D79"/>
           <w:sz w:val="40"/>
         </w:rPr>
         <w:t>FATIMA</w:t>
@@ -1586,9 +1494,6 @@
       </w:r>
     </w:p>
     <w:p>
-      <w:pPr>
-        <w:spacing w:before="0" w:after="240"/>
-      </w:pPr>
       <w:r>
         <w:rPr>
           <w:i/>
@@ -1605,7 +1510,7 @@
       <w:r>
         <w:rPr>
           <w:b/>
-          <w:color w:val="4E342E"/>
+          <w:color w:val="6D4C41"/>
           <w:sz w:val="40"/>
         </w:rPr>
         <w:t>GRAMSCI</w:t>
@@ -1619,9 +1524,6 @@
       </w:r>
     </w:p>
     <w:p>
-      <w:pPr>
-        <w:spacing w:before="0" w:after="240"/>
-      </w:pPr>
       <w:r>
         <w:rPr>
           <w:i/>
@@ -1652,9 +1554,6 @@
       </w:r>
     </w:p>
     <w:p>
-      <w:pPr>
-        <w:spacing w:before="0" w:after="240"/>
-      </w:pPr>
       <w:r>
         <w:rPr>
           <w:i/>
@@ -1671,7 +1570,7 @@
       <w:r>
         <w:rPr>
           <w:b/>
-          <w:color w:val="4E342E"/>
+          <w:color w:val="6D4C41"/>
           <w:sz w:val="40"/>
         </w:rPr>
         <w:t>GRAMSCI</w:t>
@@ -1685,9 +1584,6 @@
       </w:r>
     </w:p>
     <w:p>
-      <w:pPr>
-        <w:spacing w:before="0" w:after="240"/>
-      </w:pPr>
       <w:r>
         <w:rPr>
           <w:i/>
@@ -1704,7 +1600,7 @@
       <w:r>
         <w:rPr>
           <w:b/>
-          <w:color w:val="0E7C86"/>
+          <w:color w:val="A64D79"/>
           <w:sz w:val="40"/>
         </w:rPr>
         <w:t>FATIMA</w:t>
@@ -1718,9 +1614,6 @@
       </w:r>
     </w:p>
     <w:p>
-      <w:pPr>
-        <w:spacing w:before="0" w:after="240"/>
-      </w:pPr>
       <w:r>
         <w:rPr>
           <w:i/>
@@ -1737,7 +1630,7 @@
       <w:r>
         <w:rPr>
           <w:b/>
-          <w:color w:val="1F3864"/>
+          <w:color w:val="7F6000"/>
           <w:sz w:val="40"/>
         </w:rPr>
         <w:t>MARCO</w:t>
@@ -1751,9 +1644,6 @@
       </w:r>
     </w:p>
     <w:p>
-      <w:pPr>
-        <w:spacing w:before="0" w:after="240"/>
-      </w:pPr>
       <w:r>
         <w:rPr>
           <w:i/>
@@ -1770,7 +1660,7 @@
       <w:r>
         <w:rPr>
           <w:b/>
-          <w:color w:val="7F6000"/>
+          <w:color w:val="0E7C86"/>
           <w:sz w:val="40"/>
         </w:rPr>
         <w:t>ALESSANDRO</w:t>
@@ -1784,9 +1674,6 @@
       </w:r>
     </w:p>
     <w:p>
-      <w:pPr>
-        <w:spacing w:before="0" w:after="240"/>
-      </w:pPr>
       <w:r>
         <w:rPr>
           <w:i/>
@@ -1817,9 +1704,6 @@
       </w:r>
     </w:p>
     <w:p>
-      <w:pPr>
-        <w:spacing w:before="0" w:after="240"/>
-      </w:pPr>
       <w:r>
         <w:rPr>
           <w:i/>
@@ -1850,9 +1734,6 @@
       </w:r>
     </w:p>
     <w:p>
-      <w:pPr>
-        <w:spacing w:before="0" w:after="240"/>
-      </w:pPr>
       <w:r>
         <w:rPr>
           <w:i/>
@@ -1869,7 +1750,7 @@
       <w:r>
         <w:rPr>
           <w:b/>
-          <w:color w:val="1F3864"/>
+          <w:color w:val="7F6000"/>
           <w:sz w:val="40"/>
         </w:rPr>
         <w:t>MARCO</w:t>
@@ -1883,9 +1764,6 @@
       </w:r>
     </w:p>
     <w:p>
-      <w:pPr>
-        <w:spacing w:before="0" w:after="240"/>
-      </w:pPr>
       <w:r>
         <w:rPr>
           <w:i/>
@@ -1902,7 +1780,7 @@
       <w:r>
         <w:rPr>
           <w:b/>
-          <w:color w:val="0E7C86"/>
+          <w:color w:val="A64D79"/>
           <w:sz w:val="40"/>
         </w:rPr>
         <w:t>FATIMA</w:t>
@@ -1916,9 +1794,6 @@
       </w:r>
     </w:p>
     <w:p>
-      <w:pPr>
-        <w:spacing w:before="0" w:after="240"/>
-      </w:pPr>
       <w:r>
         <w:rPr>
           <w:i/>
@@ -1949,9 +1824,6 @@
       </w:r>
     </w:p>
     <w:p>
-      <w:pPr>
-        <w:spacing w:before="0" w:after="240"/>
-      </w:pPr>
       <w:r>
         <w:rPr>
           <w:i/>
@@ -1968,7 +1840,7 @@
       <w:r>
         <w:rPr>
           <w:b/>
-          <w:color w:val="0E7C86"/>
+          <w:color w:val="A64D79"/>
           <w:sz w:val="40"/>
         </w:rPr>
         <w:t>FATIMA</w:t>
@@ -1982,9 +1854,6 @@
       </w:r>
     </w:p>
     <w:p>
-      <w:pPr>
-        <w:spacing w:before="0" w:after="240"/>
-      </w:pPr>
       <w:r>
         <w:rPr>
           <w:i/>
@@ -2014,7 +1883,7 @@
       <w:r>
         <w:rPr>
           <w:b/>
-          <w:color w:val="5B2C6F"/>
+          <w:color w:val="7030A0"/>
           <w:sz w:val="40"/>
         </w:rPr>
         <w:t>MACHIAVELLI</w:t>
@@ -2028,9 +1897,6 @@
       </w:r>
     </w:p>
     <w:p>
-      <w:pPr>
-        <w:spacing w:before="0" w:after="240"/>
-      </w:pPr>
       <w:r>
         <w:rPr>
           <w:i/>
@@ -2047,7 +1913,7 @@
       <w:r>
         <w:rPr>
           <w:b/>
-          <w:color w:val="5B2C6F"/>
+          <w:color w:val="7030A0"/>
           <w:sz w:val="40"/>
         </w:rPr>
         <w:t>MACHIAVELLI</w:t>
@@ -2061,9 +1927,6 @@
       </w:r>
     </w:p>
     <w:p>
-      <w:pPr>
-        <w:spacing w:before="0" w:after="240"/>
-      </w:pPr>
       <w:r>
         <w:rPr>
           <w:i/>
@@ -2080,7 +1943,7 @@
       <w:r>
         <w:rPr>
           <w:b/>
-          <w:color w:val="1F3864"/>
+          <w:color w:val="7F6000"/>
           <w:sz w:val="40"/>
         </w:rPr>
         <w:t>MARCO</w:t>
@@ -2094,9 +1957,6 @@
       </w:r>
     </w:p>
     <w:p>
-      <w:pPr>
-        <w:spacing w:before="0" w:after="240"/>
-      </w:pPr>
       <w:r>
         <w:rPr>
           <w:i/>
@@ -2113,7 +1973,7 @@
       <w:r>
         <w:rPr>
           <w:b/>
-          <w:color w:val="5B2C6F"/>
+          <w:color w:val="7030A0"/>
           <w:sz w:val="40"/>
         </w:rPr>
         <w:t>MACHIAVELLI</w:t>
@@ -2127,9 +1987,6 @@
       </w:r>
     </w:p>
     <w:p>
-      <w:pPr>
-        <w:spacing w:before="0" w:after="240"/>
-      </w:pPr>
       <w:r>
         <w:rPr>
           <w:i/>
@@ -2146,7 +2003,7 @@
       <w:r>
         <w:rPr>
           <w:b/>
-          <w:color w:val="0E7C86"/>
+          <w:color w:val="A64D79"/>
           <w:sz w:val="40"/>
         </w:rPr>
         <w:t>FATIMA</w:t>
@@ -2160,9 +2017,6 @@
       </w:r>
     </w:p>
     <w:p>
-      <w:pPr>
-        <w:spacing w:before="0" w:after="240"/>
-      </w:pPr>
       <w:r>
         <w:rPr>
           <w:i/>
@@ -2179,7 +2033,7 @@
       <w:r>
         <w:rPr>
           <w:b/>
-          <w:color w:val="5B2C6F"/>
+          <w:color w:val="7030A0"/>
           <w:sz w:val="40"/>
         </w:rPr>
         <w:t>MACHIAVELLI</w:t>
@@ -2193,9 +2047,6 @@
       </w:r>
     </w:p>
     <w:p>
-      <w:pPr>
-        <w:spacing w:before="0" w:after="240"/>
-      </w:pPr>
       <w:r>
         <w:rPr>
           <w:i/>
@@ -2212,7 +2063,7 @@
       <w:r>
         <w:rPr>
           <w:b/>
-          <w:color w:val="0E7C86"/>
+          <w:color w:val="A64D79"/>
           <w:sz w:val="40"/>
         </w:rPr>
         <w:t>FATIMA</w:t>
@@ -2226,9 +2077,6 @@
       </w:r>
     </w:p>
     <w:p>
-      <w:pPr>
-        <w:spacing w:before="0" w:after="240"/>
-      </w:pPr>
       <w:r>
         <w:rPr>
           <w:i/>
@@ -2259,9 +2107,6 @@
       </w:r>
     </w:p>
     <w:p>
-      <w:pPr>
-        <w:spacing w:before="0" w:after="240"/>
-      </w:pPr>
       <w:r>
         <w:rPr>
           <w:i/>
@@ -2278,7 +2123,7 @@
       <w:r>
         <w:rPr>
           <w:b/>
-          <w:color w:val="5B2C6F"/>
+          <w:color w:val="7030A0"/>
           <w:sz w:val="40"/>
         </w:rPr>
         <w:t>MACHIAVELLI</w:t>
@@ -2292,9 +2137,6 @@
       </w:r>
     </w:p>
     <w:p>
-      <w:pPr>
-        <w:spacing w:before="0" w:after="240"/>
-      </w:pPr>
       <w:r>
         <w:rPr>
           <w:i/>
@@ -2325,9 +2167,6 @@
       </w:r>
     </w:p>
     <w:p>
-      <w:pPr>
-        <w:spacing w:before="0" w:after="240"/>
-      </w:pPr>
       <w:r>
         <w:rPr>
           <w:i/>
@@ -2344,7 +2183,7 @@
       <w:r>
         <w:rPr>
           <w:b/>
-          <w:color w:val="5B2C6F"/>
+          <w:color w:val="7030A0"/>
           <w:sz w:val="40"/>
         </w:rPr>
         <w:t>MACHIAVELLI</w:t>
@@ -2358,9 +2197,6 @@
       </w:r>
     </w:p>
     <w:p>
-      <w:pPr>
-        <w:spacing w:before="0" w:after="240"/>
-      </w:pPr>
       <w:r>
         <w:rPr>
           <w:i/>
@@ -2391,9 +2227,6 @@
       </w:r>
     </w:p>
     <w:p>
-      <w:pPr>
-        <w:spacing w:before="0" w:after="240"/>
-      </w:pPr>
       <w:r>
         <w:rPr>
           <w:i/>
@@ -2410,7 +2243,7 @@
       <w:r>
         <w:rPr>
           <w:b/>
-          <w:color w:val="5B2C6F"/>
+          <w:color w:val="7030A0"/>
           <w:sz w:val="40"/>
         </w:rPr>
         <w:t>MACHIAVELLI</w:t>
@@ -2424,9 +2257,6 @@
       </w:r>
     </w:p>
     <w:p>
-      <w:pPr>
-        <w:spacing w:before="0" w:after="240"/>
-      </w:pPr>
       <w:r>
         <w:rPr>
           <w:i/>
@@ -2443,7 +2273,7 @@
       <w:r>
         <w:rPr>
           <w:b/>
-          <w:color w:val="1F3864"/>
+          <w:color w:val="7F6000"/>
           <w:sz w:val="40"/>
         </w:rPr>
         <w:t>MARCO</w:t>
@@ -2457,9 +2287,6 @@
       </w:r>
     </w:p>
     <w:p>
-      <w:pPr>
-        <w:spacing w:before="0" w:after="240"/>
-      </w:pPr>
       <w:r>
         <w:rPr>
           <w:i/>
@@ -2476,7 +2303,7 @@
       <w:r>
         <w:rPr>
           <w:b/>
-          <w:color w:val="7F6000"/>
+          <w:color w:val="0E7C86"/>
           <w:sz w:val="40"/>
         </w:rPr>
         <w:t>ALESSANDRO</w:t>
@@ -2490,9 +2317,6 @@
       </w:r>
     </w:p>
     <w:p>
-      <w:pPr>
-        <w:spacing w:before="0" w:after="240"/>
-      </w:pPr>
       <w:r>
         <w:rPr>
           <w:i/>
@@ -2523,9 +2347,6 @@
       </w:r>
     </w:p>
     <w:p>
-      <w:pPr>
-        <w:spacing w:before="0" w:after="240"/>
-      </w:pPr>
       <w:r>
         <w:rPr>
           <w:i/>
@@ -2542,7 +2363,7 @@
       <w:r>
         <w:rPr>
           <w:b/>
-          <w:color w:val="0E7C86"/>
+          <w:color w:val="A64D79"/>
           <w:sz w:val="40"/>
         </w:rPr>
         <w:t>FATIMA</w:t>
@@ -2556,9 +2377,6 @@
       </w:r>
     </w:p>
     <w:p>
-      <w:pPr>
-        <w:spacing w:before="0" w:after="240"/>
-      </w:pPr>
       <w:r>
         <w:rPr>
           <w:i/>
@@ -2589,9 +2407,6 @@
       </w:r>
     </w:p>
     <w:p>
-      <w:pPr>
-        <w:spacing w:before="0" w:after="240"/>
-      </w:pPr>
       <w:r>
         <w:rPr>
           <w:i/>
@@ -2608,7 +2423,7 @@
       <w:r>
         <w:rPr>
           <w:b/>
-          <w:color w:val="0E7C86"/>
+          <w:color w:val="A64D79"/>
           <w:sz w:val="40"/>
         </w:rPr>
         <w:t>FATIMA</w:t>
@@ -2622,9 +2437,6 @@
       </w:r>
     </w:p>
     <w:p>
-      <w:pPr>
-        <w:spacing w:before="0" w:after="240"/>
-      </w:pPr>
       <w:r>
         <w:rPr>
           <w:i/>
@@ -2655,9 +2467,6 @@
       </w:r>
     </w:p>
     <w:p>
-      <w:pPr>
-        <w:spacing w:before="0" w:after="240"/>
-      </w:pPr>
       <w:r>
         <w:rPr>
           <w:i/>
@@ -2688,9 +2497,6 @@
       </w:r>
     </w:p>
     <w:p>
-      <w:pPr>
-        <w:spacing w:before="0" w:after="240"/>
-      </w:pPr>
       <w:r>
         <w:rPr>
           <w:i/>
@@ -2721,9 +2527,6 @@
       </w:r>
     </w:p>
     <w:p>
-      <w:pPr>
-        <w:spacing w:before="0" w:after="240"/>
-      </w:pPr>
       <w:r>
         <w:rPr>
           <w:i/>
@@ -2740,7 +2543,7 @@
       <w:r>
         <w:rPr>
           <w:b/>
-          <w:color w:val="5B2C6F"/>
+          <w:color w:val="7030A0"/>
           <w:sz w:val="40"/>
         </w:rPr>
         <w:t>MACHIAVELLI</w:t>
@@ -2754,9 +2557,6 @@
       </w:r>
     </w:p>
     <w:p>
-      <w:pPr>
-        <w:spacing w:before="0" w:after="240"/>
-      </w:pPr>
       <w:r>
         <w:rPr>
           <w:i/>
@@ -2787,9 +2587,6 @@
       </w:r>
     </w:p>
     <w:p>
-      <w:pPr>
-        <w:spacing w:before="0" w:after="240"/>
-      </w:pPr>
       <w:r>
         <w:rPr>
           <w:i/>
@@ -2806,7 +2603,7 @@
       <w:r>
         <w:rPr>
           <w:b/>
-          <w:color w:val="5B2C6F"/>
+          <w:color w:val="7030A0"/>
           <w:sz w:val="40"/>
         </w:rPr>
         <w:t>MACHIAVELLI</w:t>
@@ -2820,9 +2617,6 @@
       </w:r>
     </w:p>
     <w:p>
-      <w:pPr>
-        <w:spacing w:before="0" w:after="240"/>
-      </w:pPr>
       <w:r>
         <w:rPr>
           <w:i/>
@@ -2839,7 +2633,7 @@
       <w:r>
         <w:rPr>
           <w:b/>
-          <w:color w:val="0E7C86"/>
+          <w:color w:val="A64D79"/>
           <w:sz w:val="40"/>
         </w:rPr>
         <w:t>FATIMA</w:t>
@@ -2853,9 +2647,6 @@
       </w:r>
     </w:p>
     <w:p>
-      <w:pPr>
-        <w:spacing w:before="0" w:after="240"/>
-      </w:pPr>
       <w:r>
         <w:rPr>
           <w:i/>
@@ -2872,7 +2663,7 @@
       <w:r>
         <w:rPr>
           <w:b/>
-          <w:color w:val="7F6000"/>
+          <w:color w:val="0E7C86"/>
           <w:sz w:val="40"/>
         </w:rPr>
         <w:t>ALESSANDRO</w:t>
@@ -2886,9 +2677,6 @@
       </w:r>
     </w:p>
     <w:p>
-      <w:pPr>
-        <w:spacing w:before="0" w:after="240"/>
-      </w:pPr>
       <w:r>
         <w:rPr>
           <w:i/>
@@ -2905,7 +2693,7 @@
       <w:r>
         <w:rPr>
           <w:b/>
-          <w:color w:val="0E7C86"/>
+          <w:color w:val="A64D79"/>
           <w:sz w:val="40"/>
         </w:rPr>
         <w:t>FATIMA</w:t>
@@ -2919,9 +2707,6 @@
       </w:r>
     </w:p>
     <w:p>
-      <w:pPr>
-        <w:spacing w:before="0" w:after="240"/>
-      </w:pPr>
       <w:r>
         <w:rPr>
           <w:i/>
@@ -2938,7 +2723,7 @@
       <w:r>
         <w:rPr>
           <w:b/>
-          <w:color w:val="1F3864"/>
+          <w:color w:val="7F6000"/>
           <w:sz w:val="40"/>
         </w:rPr>
         <w:t>MARCO</w:t>
@@ -2952,9 +2737,6 @@
       </w:r>
     </w:p>
     <w:p>
-      <w:pPr>
-        <w:spacing w:before="0" w:after="240"/>
-      </w:pPr>
       <w:r>
         <w:rPr>
           <w:i/>
@@ -2998,9 +2780,6 @@
       </w:r>
     </w:p>
     <w:p>
-      <w:pPr>
-        <w:spacing w:before="0" w:after="240"/>
-      </w:pPr>
       <w:r>
         <w:rPr>
           <w:i/>
@@ -3031,9 +2810,6 @@
       </w:r>
     </w:p>
     <w:p>
-      <w:pPr>
-        <w:spacing w:before="0" w:after="240"/>
-      </w:pPr>
       <w:r>
         <w:rPr>
           <w:i/>
@@ -3050,7 +2826,7 @@
       <w:r>
         <w:rPr>
           <w:b/>
-          <w:color w:val="1F3864"/>
+          <w:color w:val="7F6000"/>
           <w:sz w:val="40"/>
         </w:rPr>
         <w:t>MARCO</w:t>
@@ -3064,9 +2840,6 @@
       </w:r>
     </w:p>
     <w:p>
-      <w:pPr>
-        <w:spacing w:before="0" w:after="240"/>
-      </w:pPr>
       <w:r>
         <w:rPr>
           <w:i/>
@@ -3097,9 +2870,6 @@
       </w:r>
     </w:p>
     <w:p>
-      <w:pPr>
-        <w:spacing w:before="0" w:after="240"/>
-      </w:pPr>
       <w:r>
         <w:rPr>
           <w:i/>
@@ -3116,7 +2886,7 @@
       <w:r>
         <w:rPr>
           <w:b/>
-          <w:color w:val="1F3864"/>
+          <w:color w:val="7F6000"/>
           <w:sz w:val="40"/>
         </w:rPr>
         <w:t>MARCO</w:t>
@@ -3130,9 +2900,6 @@
       </w:r>
     </w:p>
     <w:p>
-      <w:pPr>
-        <w:spacing w:before="0" w:after="240"/>
-      </w:pPr>
       <w:r>
         <w:rPr>
           <w:i/>
@@ -3149,7 +2916,7 @@
       <w:r>
         <w:rPr>
           <w:b/>
-          <w:color w:val="7F6000"/>
+          <w:color w:val="0E7C86"/>
           <w:sz w:val="40"/>
         </w:rPr>
         <w:t>ALESSANDRO</w:t>
@@ -3163,9 +2930,6 @@
       </w:r>
     </w:p>
     <w:p>
-      <w:pPr>
-        <w:spacing w:before="0" w:after="240"/>
-      </w:pPr>
       <w:r>
         <w:rPr>
           <w:i/>
@@ -3182,7 +2946,7 @@
       <w:r>
         <w:rPr>
           <w:b/>
-          <w:color w:val="0E7C86"/>
+          <w:color w:val="A64D79"/>
           <w:sz w:val="40"/>
         </w:rPr>
         <w:t>FATIMA</w:t>
@@ -3196,9 +2960,6 @@
       </w:r>
     </w:p>
     <w:p>
-      <w:pPr>
-        <w:spacing w:before="0" w:after="240"/>
-      </w:pPr>
       <w:r>
         <w:rPr>
           <w:i/>
@@ -3229,9 +2990,6 @@
       </w:r>
     </w:p>
     <w:p>
-      <w:pPr>
-        <w:spacing w:before="0" w:after="240"/>
-      </w:pPr>
       <w:r>
         <w:rPr>
           <w:i/>
@@ -3262,9 +3020,6 @@
       </w:r>
     </w:p>
     <w:p>
-      <w:pPr>
-        <w:spacing w:before="0" w:after="240"/>
-      </w:pPr>
       <w:r>
         <w:rPr>
           <w:i/>
@@ -3295,9 +3050,6 @@
       </w:r>
     </w:p>
     <w:p>
-      <w:pPr>
-        <w:spacing w:before="0" w:after="240"/>
-      </w:pPr>
       <w:r>
         <w:rPr>
           <w:i/>
@@ -3314,7 +3066,7 @@
       <w:r>
         <w:rPr>
           <w:b/>
-          <w:color w:val="5B2C6F"/>
+          <w:color w:val="7030A0"/>
           <w:sz w:val="40"/>
         </w:rPr>
         <w:t>MACHIAVELLI</w:t>
@@ -3328,9 +3080,6 @@
       </w:r>
     </w:p>
     <w:p>
-      <w:pPr>
-        <w:spacing w:before="0" w:after="240"/>
-      </w:pPr>
       <w:r>
         <w:rPr>
           <w:i/>
@@ -3361,9 +3110,6 @@
       </w:r>
     </w:p>
     <w:p>
-      <w:pPr>
-        <w:spacing w:before="0" w:after="240"/>
-      </w:pPr>
       <w:r>
         <w:rPr>
           <w:i/>
@@ -3394,9 +3140,6 @@
       </w:r>
     </w:p>
     <w:p>
-      <w:pPr>
-        <w:spacing w:before="0" w:after="240"/>
-      </w:pPr>
       <w:r>
         <w:rPr>
           <w:i/>
@@ -3427,9 +3170,6 @@
       </w:r>
     </w:p>
     <w:p>
-      <w:pPr>
-        <w:spacing w:before="0" w:after="240"/>
-      </w:pPr>
       <w:r>
         <w:rPr>
           <w:i/>
@@ -3446,7 +3186,7 @@
       <w:r>
         <w:rPr>
           <w:b/>
-          <w:color w:val="4E342E"/>
+          <w:color w:val="6D4C41"/>
           <w:sz w:val="40"/>
         </w:rPr>
         <w:t>GRAMSCI</w:t>
@@ -3460,9 +3200,6 @@
       </w:r>
     </w:p>
     <w:p>
-      <w:pPr>
-        <w:spacing w:before="0" w:after="240"/>
-      </w:pPr>
       <w:r>
         <w:rPr>
           <w:i/>
@@ -3479,7 +3216,7 @@
       <w:r>
         <w:rPr>
           <w:b/>
-          <w:color w:val="1F3864"/>
+          <w:color w:val="7F6000"/>
           <w:sz w:val="40"/>
         </w:rPr>
         <w:t>MARCO</w:t>
@@ -3493,9 +3230,6 @@
       </w:r>
     </w:p>
     <w:p>
-      <w:pPr>
-        <w:spacing w:before="0" w:after="240"/>
-      </w:pPr>
       <w:r>
         <w:rPr>
           <w:i/>
@@ -3512,7 +3246,7 @@
       <w:r>
         <w:rPr>
           <w:b/>
-          <w:color w:val="4E342E"/>
+          <w:color w:val="6D4C41"/>
           <w:sz w:val="40"/>
         </w:rPr>
         <w:t>GRAMSCI</w:t>
@@ -3526,9 +3260,6 @@
       </w:r>
     </w:p>
     <w:p>
-      <w:pPr>
-        <w:spacing w:before="0" w:after="240"/>
-      </w:pPr>
       <w:r>
         <w:rPr>
           <w:i/>
@@ -3559,9 +3290,6 @@
       </w:r>
     </w:p>
     <w:p>
-      <w:pPr>
-        <w:spacing w:before="0" w:after="240"/>
-      </w:pPr>
       <w:r>
         <w:rPr>
           <w:i/>
@@ -3578,7 +3306,7 @@
       <w:r>
         <w:rPr>
           <w:b/>
-          <w:color w:val="4E342E"/>
+          <w:color w:val="6D4C41"/>
           <w:sz w:val="40"/>
         </w:rPr>
         <w:t>GRAMSCI</w:t>
@@ -3592,9 +3320,6 @@
       </w:r>
     </w:p>
     <w:p>
-      <w:pPr>
-        <w:spacing w:before="0" w:after="240"/>
-      </w:pPr>
       <w:r>
         <w:rPr>
           <w:i/>
@@ -3611,7 +3336,7 @@
       <w:r>
         <w:rPr>
           <w:b/>
-          <w:color w:val="7F6000"/>
+          <w:color w:val="0E7C86"/>
           <w:sz w:val="40"/>
         </w:rPr>
         <w:t>ALESSANDRO</w:t>
@@ -3625,9 +3350,6 @@
       </w:r>
     </w:p>
     <w:p>
-      <w:pPr>
-        <w:spacing w:before="0" w:after="240"/>
-      </w:pPr>
       <w:r>
         <w:rPr>
           <w:i/>
@@ -3644,7 +3366,7 @@
       <w:r>
         <w:rPr>
           <w:b/>
-          <w:color w:val="0E7C86"/>
+          <w:color w:val="A64D79"/>
           <w:sz w:val="40"/>
         </w:rPr>
         <w:t>FATIMA</w:t>
@@ -3658,9 +3380,6 @@
       </w:r>
     </w:p>
     <w:p>
-      <w:pPr>
-        <w:spacing w:before="0" w:after="240"/>
-      </w:pPr>
       <w:r>
         <w:rPr>
           <w:i/>
@@ -3677,7 +3396,7 @@
       <w:r>
         <w:rPr>
           <w:b/>
-          <w:color w:val="1F3864"/>
+          <w:color w:val="7F6000"/>
           <w:sz w:val="40"/>
         </w:rPr>
         <w:t>MARCO</w:t>
@@ -3691,9 +3410,6 @@
       </w:r>
     </w:p>
     <w:p>
-      <w:pPr>
-        <w:spacing w:before="0" w:after="240"/>
-      </w:pPr>
       <w:r>
         <w:rPr>
           <w:i/>
@@ -3710,7 +3426,7 @@
       <w:r>
         <w:rPr>
           <w:b/>
-          <w:color w:val="0E7C86"/>
+          <w:color w:val="A64D79"/>
           <w:sz w:val="40"/>
         </w:rPr>
         <w:t>FATIMA</w:t>
@@ -3724,9 +3440,6 @@
       </w:r>
     </w:p>
     <w:p>
-      <w:pPr>
-        <w:spacing w:before="0" w:after="240"/>
-      </w:pPr>
       <w:r>
         <w:rPr>
           <w:i/>
@@ -3757,9 +3470,6 @@
       </w:r>
     </w:p>
     <w:p>
-      <w:pPr>
-        <w:spacing w:before="0" w:after="240"/>
-      </w:pPr>
       <w:r>
         <w:rPr>
           <w:i/>
@@ -3776,7 +3486,7 @@
       <w:r>
         <w:rPr>
           <w:b/>
-          <w:color w:val="0E7C86"/>
+          <w:color w:val="A64D79"/>
           <w:sz w:val="40"/>
         </w:rPr>
         <w:t>FATIMA</w:t>
@@ -3790,9 +3500,6 @@
       </w:r>
     </w:p>
     <w:p>
-      <w:pPr>
-        <w:spacing w:before="0" w:after="240"/>
-      </w:pPr>
       <w:r>
         <w:rPr>
           <w:i/>
@@ -3836,9 +3543,6 @@
       </w:r>
     </w:p>
     <w:p>
-      <w:pPr>
-        <w:spacing w:before="0" w:after="240"/>
-      </w:pPr>
       <w:r>
         <w:rPr>
           <w:i/>
@@ -3855,7 +3559,7 @@
       <w:r>
         <w:rPr>
           <w:b/>
-          <w:color w:val="0E7C86"/>
+          <w:color w:val="A64D79"/>
           <w:sz w:val="40"/>
         </w:rPr>
         <w:t>FATIMA</w:t>
@@ -3869,9 +3573,6 @@
       </w:r>
     </w:p>
     <w:p>
-      <w:pPr>
-        <w:spacing w:before="0" w:after="240"/>
-      </w:pPr>
       <w:r>
         <w:rPr>
           <w:i/>
@@ -3902,9 +3603,6 @@
       </w:r>
     </w:p>
     <w:p>
-      <w:pPr>
-        <w:spacing w:before="0" w:after="240"/>
-      </w:pPr>
       <w:r>
         <w:rPr>
           <w:i/>
@@ -3935,9 +3633,6 @@
       </w:r>
     </w:p>
     <w:p>
-      <w:pPr>
-        <w:spacing w:before="0" w:after="240"/>
-      </w:pPr>
       <w:r>
         <w:rPr>
           <w:i/>
@@ -3968,9 +3663,6 @@
       </w:r>
     </w:p>
     <w:p>
-      <w:pPr>
-        <w:spacing w:before="0" w:after="240"/>
-      </w:pPr>
       <w:r>
         <w:rPr>
           <w:i/>
@@ -3987,7 +3679,7 @@
       <w:r>
         <w:rPr>
           <w:b/>
-          <w:color w:val="7F6000"/>
+          <w:color w:val="0E7C86"/>
           <w:sz w:val="40"/>
         </w:rPr>
         <w:t>ALESSANDRO</w:t>
@@ -4001,9 +3693,6 @@
       </w:r>
     </w:p>
     <w:p>
-      <w:pPr>
-        <w:spacing w:before="0" w:after="240"/>
-      </w:pPr>
       <w:r>
         <w:rPr>
           <w:i/>
@@ -4020,7 +3709,7 @@
       <w:r>
         <w:rPr>
           <w:b/>
-          <w:color w:val="1F3864"/>
+          <w:color w:val="7F6000"/>
           <w:sz w:val="40"/>
         </w:rPr>
         <w:t>MARCO</w:t>
@@ -4034,9 +3723,6 @@
       </w:r>
     </w:p>
     <w:p>
-      <w:pPr>
-        <w:spacing w:before="0" w:after="240"/>
-      </w:pPr>
       <w:r>
         <w:rPr>
           <w:i/>
@@ -4053,7 +3739,7 @@
       <w:r>
         <w:rPr>
           <w:b/>
-          <w:color w:val="5B2C6F"/>
+          <w:color w:val="7030A0"/>
           <w:sz w:val="40"/>
         </w:rPr>
         <w:t>MACHIAVELLI</w:t>
@@ -4067,9 +3753,6 @@
       </w:r>
     </w:p>
     <w:p>
-      <w:pPr>
-        <w:spacing w:before="0" w:after="240"/>
-      </w:pPr>
       <w:r>
         <w:rPr>
           <w:i/>
@@ -4100,9 +3783,6 @@
       </w:r>
     </w:p>
     <w:p>
-      <w:pPr>
-        <w:spacing w:before="0" w:after="240"/>
-      </w:pPr>
       <w:r>
         <w:rPr>
           <w:i/>
@@ -4119,7 +3799,7 @@
       <w:r>
         <w:rPr>
           <w:b/>
-          <w:color w:val="4E342E"/>
+          <w:color w:val="6D4C41"/>
           <w:sz w:val="40"/>
         </w:rPr>
         <w:t>GRAMSCI</w:t>
@@ -4133,9 +3813,6 @@
       </w:r>
     </w:p>
     <w:p>
-      <w:pPr>
-        <w:spacing w:before="0" w:after="240"/>
-      </w:pPr>
       <w:r>
         <w:rPr>
           <w:i/>
@@ -4166,9 +3843,6 @@
       </w:r>
     </w:p>
     <w:p>
-      <w:pPr>
-        <w:spacing w:before="0" w:after="240"/>
-      </w:pPr>
       <w:r>
         <w:rPr>
           <w:i/>
@@ -4185,7 +3859,7 @@
       <w:r>
         <w:rPr>
           <w:b/>
-          <w:color w:val="0E7C86"/>
+          <w:color w:val="A64D79"/>
           <w:sz w:val="40"/>
         </w:rPr>
         <w:t>FATIMA</w:t>
@@ -4199,9 +3873,6 @@
       </w:r>
     </w:p>
     <w:p>
-      <w:pPr>
-        <w:spacing w:before="0" w:after="240"/>
-      </w:pPr>
       <w:r>
         <w:rPr>
           <w:i/>
@@ -4232,9 +3903,6 @@
       </w:r>
     </w:p>
     <w:p>
-      <w:pPr>
-        <w:spacing w:before="0" w:after="240"/>
-      </w:pPr>
       <w:r>
         <w:rPr>
           <w:i/>
@@ -4251,7 +3919,7 @@
       <w:r>
         <w:rPr>
           <w:b/>
-          <w:color w:val="0E7C86"/>
+          <w:color w:val="A64D79"/>
           <w:sz w:val="40"/>
         </w:rPr>
         <w:t>FATIMA</w:t>
@@ -4265,9 +3933,6 @@
       </w:r>
     </w:p>
     <w:p>
-      <w:pPr>
-        <w:spacing w:before="0" w:after="240"/>
-      </w:pPr>
       <w:r>
         <w:rPr>
           <w:i/>
@@ -4298,9 +3963,6 @@
       </w:r>
     </w:p>
     <w:p>
-      <w:pPr>
-        <w:spacing w:before="0" w:after="240"/>
-      </w:pPr>
       <w:r>
         <w:rPr>
           <w:i/>
@@ -4310,35 +3972,97 @@
         <w:t>내일 봐. 그리고 이제, 다들 나가. 홀 닫을 거야.</w:t>
       </w:r>
     </w:p>
+    <w:p/>
     <w:p>
       <w:pPr>
-        <w:spacing w:before="400" w:after="120"/>
+        <w:spacing w:after="160"/>
       </w:pPr>
       <w:r>
         <w:rPr>
           <w:b/>
+          <w:i w:val="0"/>
           <w:color w:val="1F3864"/>
-          <w:sz w:val="40"/>
+          <w:sz w:val="44"/>
         </w:rPr>
         <w:t>다음 화 예고</w:t>
       </w:r>
     </w:p>
     <w:p>
-      <w:r>
-        <w:rPr>
+      <w:pPr>
+        <w:spacing w:after="160"/>
+      </w:pPr>
+      <w:r>
+        <w:rPr>
+          <w:b w:val="0"/>
+          <w:i w:val="0"/>
           <w:sz w:val="40"/>
         </w:rPr>
         <w:t>1부 2화 — «La clausola che non sale»(오르지 않는 조항) — Fatima와 Sofia가 계약서를 가져오고, Gramsci의 카드로 ISTAT 물가 연동 한도를 넘는 인상이 부당함을 확인합니다. 기한 안에 등기우편으로 답장을 씁니다.</w:t>
       </w:r>
     </w:p>
     <w:sectPr>
-      <w:pgSz w:w="11906" w:h="15840"/>
-      <w:pgMar w:top="1440" w:right="1800" w:bottom="1440" w:left="1800" w:header="720" w:footer="720" w:gutter="0"/>
+      <w:headerReference w:type="default" r:id="rId9"/>
+      <w:footerReference w:type="default" r:id="rId10"/>
+      <w:pgSz w:w="11906" w:h="16838"/>
+      <w:pgMar w:top="1134" w:right="1417" w:bottom="1134" w:left="1417" w:header="708" w:footer="708" w:gutter="0"/>
       <w:cols w:space="720"/>
       <w:docGrid w:linePitch="360"/>
     </w:sectPr>
   </w:body>
 </w:document>
+</file>
+
+<file path=word/footer1.xml><?xml version="1.0" encoding="utf-8"?>
+<w:ftr xmlns:m="http://schemas.openxmlformats.org/officeDocument/2006/math" xmlns:mc="http://schemas.openxmlformats.org/markup-compatibility/2006" xmlns:mo="http://schemas.microsoft.com/office/mac/office/2008/main" xmlns:mv="urn:schemas-microsoft-com:mac:vml" xmlns:o="urn:schemas-microsoft-com:office:office" xmlns:r="http://schemas.openxmlformats.org/officeDocument/2006/relationships" xmlns:v="urn:schemas-microsoft-com:vml" xmlns:w10="urn:schemas-microsoft-com:office:word" xmlns:w14="http://schemas.microsoft.com/office/word/2010/wordml" xmlns:w="http://schemas.openxmlformats.org/wordprocessingml/2006/main" xmlns:wne="http://schemas.microsoft.com/office/word/2006/wordml" xmlns:wp14="http://schemas.microsoft.com/office/word/2010/wordprocessingDrawing" xmlns:wp="http://schemas.openxmlformats.org/drawingml/2006/wordprocessingDrawing" xmlns:wpc="http://schemas.microsoft.com/office/word/2010/wordprocessingCanvas" xmlns:wpg="http://schemas.microsoft.com/office/word/2010/wordprocessingGroup" xmlns:wpi="http://schemas.microsoft.com/office/word/2010/wordprocessingInk" xmlns:wps="http://schemas.microsoft.com/office/word/2010/wordprocessingShape" mc:Ignorable="w14 wp14">
+  <w:p>
+    <w:pPr>
+      <w:pStyle w:val="Footer"/>
+      <w:jc w:val="center"/>
+    </w:pPr>
+    <w:r>
+      <w:rPr>
+        <w:color w:val="A6A6A6"/>
+        <w:sz w:val="36"/>
+      </w:rPr>
+      <w:t xml:space="preserve">— </w:t>
+    </w:r>
+    <w:r>
+      <w:rPr>
+        <w:color w:val="A6A6A6"/>
+        <w:sz w:val="36"/>
+      </w:rPr>
+      <w:fldChar w:fldCharType="begin"/>
+      <w:instrText xml:space="preserve">PAGE</w:instrText>
+      <w:fldChar w:fldCharType="separate"/>
+      <w:fldChar w:fldCharType="end"/>
+    </w:r>
+    <w:r>
+      <w:rPr>
+        <w:color w:val="A6A6A6"/>
+        <w:sz w:val="36"/>
+      </w:rPr>
+      <w:t xml:space="preserve"> —</w:t>
+    </w:r>
+  </w:p>
+</w:ftr>
+</file>
+
+<file path=word/header1.xml><?xml version="1.0" encoding="utf-8"?>
+<w:hdr xmlns:m="http://schemas.openxmlformats.org/officeDocument/2006/math" xmlns:mc="http://schemas.openxmlformats.org/markup-compatibility/2006" xmlns:mo="http://schemas.microsoft.com/office/mac/office/2008/main" xmlns:mv="urn:schemas-microsoft-com:mac:vml" xmlns:o="urn:schemas-microsoft-com:office:office" xmlns:r="http://schemas.openxmlformats.org/officeDocument/2006/relationships" xmlns:v="urn:schemas-microsoft-com:vml" xmlns:w10="urn:schemas-microsoft-com:office:word" xmlns:w14="http://schemas.microsoft.com/office/word/2010/wordml" xmlns:w="http://schemas.openxmlformats.org/wordprocessingml/2006/main" xmlns:wne="http://schemas.microsoft.com/office/word/2006/wordml" xmlns:wp14="http://schemas.microsoft.com/office/word/2010/wordprocessingDrawing" xmlns:wp="http://schemas.openxmlformats.org/drawingml/2006/wordprocessingDrawing" xmlns:wpc="http://schemas.microsoft.com/office/word/2010/wordprocessingCanvas" xmlns:wpg="http://schemas.microsoft.com/office/word/2010/wordprocessingGroup" xmlns:wpi="http://schemas.microsoft.com/office/word/2010/wordprocessingInk" xmlns:wps="http://schemas.microsoft.com/office/word/2010/wordprocessingShape" mc:Ignorable="w14 wp14">
+  <w:p>
+    <w:pPr>
+      <w:pStyle w:val="Header"/>
+      <w:jc w:val="right"/>
+    </w:pPr>
+    <w:r>
+      <w:rPr>
+        <w:color w:val="A6A6A6"/>
+        <w:sz w:val="32"/>
+      </w:rPr>
+      <w:t>Roma — 1부 · 1화 · Un'altra lettera</w:t>
+    </w:r>
+  </w:p>
+</w:hdr>
 </file>
 
 <file path=word/numbering.xml><?xml version="1.0" encoding="utf-8"?>

</xml_diff>

<commit_message>
Add formal Italian titles for resurrected characters' vocative address
When another character directly addresses a resurrected figure by
name, use their historical role/title instead of a bare name:
Console Cesare, Segretario Gramsci, Segretario Machiavelli. Bare
names stay for third-person reference, self-reference (Cesare's
3rd-person habit), and tu-register banter. Cast list now notes each
title.

Co-Authored-By: Claude Sonnet 5 <noreply@anthropic.com>
Claude-Session: https://claude.ai/code/session_01F4RAWDNSfRbtuchEfG1S4a
</commit_message>
<xml_diff>
--- a/1부1화_Un_altra_lettera.docx
+++ b/1부1화_Un_altra_lettera.docx
@@ -259,7 +259,7 @@
           <w:color w:val="595959"/>
           <w:sz w:val="36"/>
         </w:rPr>
-        <w:t>부활한 정치가·장군 (기원전 100–44)</w:t>
+        <w:t>부활한 정치가·장군 (기원전 100–44) · Console Cesare</w:t>
       </w:r>
     </w:p>
     <w:p>
@@ -279,7 +279,7 @@
           <w:color w:val="595959"/>
           <w:sz w:val="36"/>
         </w:rPr>
-        <w:t>부활한 사상가 (1891–1937)</w:t>
+        <w:t>부활한 사상가 (1891–1937) · Segretario Gramsci</w:t>
       </w:r>
     </w:p>
     <w:p>
@@ -299,7 +299,7 @@
           <w:color w:val="595959"/>
           <w:sz w:val="36"/>
         </w:rPr>
-        <w:t>부활한 정치사상가 (1469–1527)</w:t>
+        <w:t>부활한 정치사상가 (1469–1527) · Segretario Machiavelli</w:t>
       </w:r>
     </w:p>
     <w:p>
@@ -697,7 +697,7 @@
           <w:color w:val="1A1A1A"/>
           <w:sz w:val="44"/>
         </w:rPr>
-        <w:t xml:space="preserve">   Quali giorni, Gramsci? Aspetti, mi spieghi?</w:t>
+        <w:t xml:space="preserve">   Quali giorni, Segretario Gramsci? Aspetti, mi spieghi?</w:t>
       </w:r>
     </w:p>
     <w:p>
@@ -707,7 +707,7 @@
           <w:color w:val="808080"/>
           <w:sz w:val="36"/>
         </w:rPr>
-        <w:t>무슨 날짜요, 그람시? 잠깐, 설명해 주실래요?</w:t>
+        <w:t>무슨 날짜요, 그람시 서기장님? 잠깐, 설명해 주실래요?</w:t>
       </w:r>
     </w:p>
     <w:p>
@@ -1550,7 +1550,7 @@
           <w:color w:val="1A1A1A"/>
           <w:sz w:val="44"/>
         </w:rPr>
-        <w:t xml:space="preserve">   Gramsci, aspetti! Quale lettera vecchia?</w:t>
+        <w:t xml:space="preserve">   Segretario Gramsci, aspetti! Quale lettera vecchia?</w:t>
       </w:r>
     </w:p>
     <w:p>
@@ -1560,7 +1560,7 @@
           <w:color w:val="808080"/>
           <w:sz w:val="36"/>
         </w:rPr>
-        <w:t>그람시, 잠깐만요! 무슨 옛날 편지요?</w:t>
+        <w:t>그람시 서기장님, 잠깐만요! 무슨 옛날 편지요?</w:t>
       </w:r>
     </w:p>
     <w:p>
@@ -2553,7 +2553,7 @@
           <w:color w:val="1A1A1A"/>
           <w:sz w:val="44"/>
         </w:rPr>
-        <w:t xml:space="preserve">   Almeno la lettera lascia una traccia, Cesare. Il legionario no.</w:t>
+        <w:t xml:space="preserve">   Almeno la lettera lascia una traccia, Console Cesare. Il legionario no.</w:t>
       </w:r>
     </w:p>
     <w:p>
@@ -2563,7 +2563,7 @@
           <w:color w:val="808080"/>
           <w:sz w:val="36"/>
         </w:rPr>
-        <w:t>적어도 편지는 흔적을 남기죠, 체사레. 군단병은 안 그래요.</w:t>
+        <w:t>적어도 편지는 흔적을 남기죠, 체사레 집정관님. 군단병은 안 그래요.</w:t>
       </w:r>
     </w:p>
     <w:p>
@@ -3136,7 +3136,7 @@
           <w:color w:val="1A1A1A"/>
           <w:sz w:val="44"/>
         </w:rPr>
-        <w:t xml:space="preserve">   Ma può perdere una casa, Cesare, se sbagliamo i conti.</w:t>
+        <w:t xml:space="preserve">   Ma può perdere una casa, Console Cesare, se sbagliamo i conti.</w:t>
       </w:r>
     </w:p>
     <w:p>
@@ -3146,7 +3146,7 @@
           <w:color w:val="808080"/>
           <w:sz w:val="36"/>
         </w:rPr>
-        <w:t>근데 계산을 잘못하면 집을 잃을 수도 있어요, 체사레.</w:t>
+        <w:t>근데 계산을 잘못하면 집을 잃을 수도 있어요, 체사레 집정관님.</w:t>
       </w:r>
     </w:p>
     <w:p>
@@ -3226,7 +3226,7 @@
           <w:color w:val="1A1A1A"/>
           <w:sz w:val="44"/>
         </w:rPr>
-        <w:t xml:space="preserve">   Dalla prima, non dalla seconda? Perché, Gramsci?</w:t>
+        <w:t xml:space="preserve">   Dalla prima, non dalla seconda? Perché, Segretario Gramsci?</w:t>
       </w:r>
     </w:p>
     <w:p>
@@ -3236,7 +3236,7 @@
           <w:color w:val="808080"/>
           <w:sz w:val="36"/>
         </w:rPr>
-        <w:t>두 번째 말고 첫 번째부터요? 왜죠, 그람시?</w:t>
+        <w:t>두 번째 말고 첫 번째부터요? 왜죠, 그람시 서기장님?</w:t>
       </w:r>
     </w:p>
     <w:p>
@@ -3286,7 +3286,7 @@
           <w:color w:val="1A1A1A"/>
           <w:sz w:val="44"/>
         </w:rPr>
-        <w:t xml:space="preserve">   Non capisco niente, Gramsci. Può dirlo più semplice?</w:t>
+        <w:t xml:space="preserve">   Non capisco niente, Segretario Gramsci. Può dirlo più semplice?</w:t>
       </w:r>
     </w:p>
     <w:p>
@@ -3296,7 +3296,7 @@
           <w:color w:val="808080"/>
           <w:sz w:val="36"/>
         </w:rPr>
-        <w:t>하나도 모르겠어요, 그람시. 더 쉽게 말해 주실래요?</w:t>
+        <w:t>하나도 모르겠어요, 그람시 서기장님. 더 쉽게 말해 주실래요?</w:t>
       </w:r>
     </w:p>
     <w:p>

</xml_diff>